<commit_message>
docs(D3,P4): propuesta de R_E fiel al Titulo I (opcion 0 con regla de vigilancia), plan actualizado y grilla para COPEC y ECL
Elaborado por PS con apoyo de Claude Code; pendiente de revision por BF.

Co-Authored-By: Claude Sonnet 5.5 <noreply@anthropic.com>
</commit_message>
<xml_diff>
--- a/docs/Plan_Sprint5_12-23oct2026.docx
+++ b/docs/Plan_Sprint5_12-23oct2026.docx
@@ -5954,7 +5954,7 @@
                 <w:sz w:val="19"/>
                 <w:szCs w:val="19"/>
               </w:rPr>
-              <w:t xml:space="preserve">T5 entregada. Reunión de cierre, documento </w:t>
+              <w:t xml:space="preserve">T5 entregada. Revisión final de R_E (D3): con el cumplimiento de la 2.3.5 se confirma la opción 0 o se pasa a la A. Reunión de cierre, documento </w:t>
             </w:r>
             <w:r>
               <w:rPr>
@@ -17355,7 +17355,7 @@
                 <w:sz w:val="19"/>
                 <w:szCs w:val="19"/>
               </w:rPr>
-              <w:t xml:space="preserve">BF decide (con opinión de MR y PS). PS implementa.</w:t>
+              <w:t xml:space="preserve">BF decide (con opinión de MR y PS). PS implementa lo que haga falta.</w:t>
             </w:r>
           </w:p>
         </w:tc>
@@ -17420,7 +17420,7 @@
                 <w:sz w:val="19"/>
                 <w:szCs w:val="19"/>
               </w:rPr>
-              <w:t xml:space="preserve">3 h de decisión + 4 h de implementación</w:t>
+              <w:t xml:space="preserve">3 h de decisión + 4 h de implementación (la opción A ya está implementada)</w:t>
             </w:r>
           </w:p>
         </w:tc>
@@ -17552,7 +17552,7 @@
                 <w:sz w:val="19"/>
                 <w:szCs w:val="19"/>
               </w:rPr>
-              <w:t xml:space="preserve">Decisión miércoles 14 oct; implementación viernes 16 oct</w:t>
+              <w:t xml:space="preserve">Decisión miércoles 14 oct; revisión final viernes 23 oct</w:t>
             </w:r>
           </w:p>
         </w:tc>
@@ -17647,7 +17647,7 @@
                 <w:sz w:val="19"/>
                 <w:szCs w:val="19"/>
               </w:rPr>
-              <w:t xml:space="preserve">En la fase 2 de β se vio que con β alto la red aprende a no operar, porque el riesgo se castiga en proporción a la cantidad ejecutada. Hay que decidir qué hacer antes de entrenar (T5). Ver la decisión D3 con las tres opciones y la recomendación.</w:t>
+              <w:t xml:space="preserve">En la fase 2 de β se vio que con β alto la red aprende a no operar, porque el riesgo se castiga en proporción a la cantidad ejecutada (como define el Título I). La propuesta de PS, la más fiel al Título I, es mantener la fórmula y el β calibrado (0,0061796) con una regla de vigilancia: si el cumplimiento de la orden baja del 95 % en la 2.3.5, se pasa a la opción A (riesgo sobre lo pendiente). Ver la decisión D3.</w:t>
             </w:r>
           </w:p>
         </w:tc>
@@ -17717,7 +17717,7 @@
                 <w:sz w:val="19"/>
                 <w:szCs w:val="19"/>
               </w:rPr>
-              <w:t xml:space="preserve">BF anota su decisión (A, B o C) en el grupo antes del miércoles 14 oct a las 18:00.</w:t>
+              <w:t xml:space="preserve">BF responde en el grupo antes del miércoles 14 oct a las 18:00: “D3: 0” (confirma la propuesta), A, B o C. Si no responde, rige la opción 0 y no cambia nada en el código.</w:t>
             </w:r>
           </w:p>
           <w:p>
@@ -17735,7 +17735,7 @@
                 <w:sz w:val="19"/>
                 <w:szCs w:val="19"/>
               </w:rPr>
-              <w:t xml:space="preserve">PS implementa la opción elegida en </w:t>
+              <w:t xml:space="preserve">Durante la 2.3.5 se mide el cumplimiento de la orden. Si baja del 95 %, PS activa la opción A (</w:t>
             </w:r>
             <w:r>
               <w:rPr>
@@ -17744,32 +17744,15 @@
                 <w:sz w:val="18"/>
                 <w:szCs w:val="18"/>
               </w:rPr>
-              <w:t xml:space="preserve">src/envs/reward_utils.py</w:t>
-            </w:r>
-            <w:r>
-              <w:rPr>
-                <w:rFonts w:ascii="Calibri" w:cs="Calibri" w:eastAsia="Calibri" w:hAnsi="Calibri"/>
-                <w:sz w:val="19"/>
-                <w:szCs w:val="19"/>
-              </w:rPr>
-              <w:t xml:space="preserve">, actualiza los entornos y los tests y deja </w:t>
-            </w:r>
-            <w:r>
-              <w:rPr>
-                <w:rFonts w:ascii="Consolas" w:cs="Consolas" w:eastAsia="Consolas" w:hAnsi="Consolas"/>
-                <w:color w:val="7B2D26"/>
-                <w:sz w:val="18"/>
-                <w:szCs w:val="18"/>
-              </w:rPr>
-              <w:t xml:space="preserve">docs/</w:t>
-            </w:r>
-            <w:r>
-              <w:rPr>
-                <w:rFonts w:ascii="Calibri" w:cs="Calibri" w:eastAsia="Calibri" w:hAnsi="Calibri"/>
-                <w:sz w:val="19"/>
-                <w:szCs w:val="19"/>
-              </w:rPr>
-              <w:t xml:space="preserve"> con la fórmula final.</w:t>
+              <w:t xml:space="preserve">riesgo_sobre="pendiente"</w:t>
+            </w:r>
+            <w:r>
+              <w:rPr>
+                <w:rFonts w:ascii="Calibri" w:cs="Calibri" w:eastAsia="Calibri" w:hAnsi="Calibri"/>
+                <w:sz w:val="19"/>
+                <w:szCs w:val="19"/>
+              </w:rPr>
+              <w:t xml:space="preserve">), BF recalcula β* y se repite la fase 2 de β.</w:t>
             </w:r>
           </w:p>
           <w:p>
@@ -17787,7 +17770,7 @@
                 <w:sz w:val="19"/>
                 <w:szCs w:val="19"/>
               </w:rPr>
-              <w:t xml:space="preserve">Si se elige la opción A, BF repite el barrido heurístico de β* en ABIDES (aprox. 1 h de Colab) antes del 19 oct y PS repite la fase 2 en P5.</w:t>
+              <w:t xml:space="preserve">Revisión al final del sprint (viernes 23 oct): con los resultados de la 2.3.5 se confirma la opción 0 o se pasa a la A, y queda escrito.</w:t>
             </w:r>
           </w:p>
         </w:tc>
@@ -17852,7 +17835,7 @@
                 <w:sz w:val="19"/>
                 <w:szCs w:val="19"/>
               </w:rPr>
-              <w:t xml:space="preserve">Decisión escrita, fórmula en el código y los tests, y una nota en </w:t>
+              <w:t xml:space="preserve">Decisión escrita y, si se cambia algo respecto del Título I, una nota en </w:t>
             </w:r>
             <w:r>
               <w:rPr>
@@ -17869,7 +17852,7 @@
                 <w:sz w:val="19"/>
                 <w:szCs w:val="19"/>
               </w:rPr>
-              <w:t xml:space="preserve"> si se cambia algo respecto del Título I.</w:t>
+              <w:t xml:space="preserve"> con los datos que lo justifican.</w:t>
             </w:r>
           </w:p>
         </w:tc>
@@ -19753,7 +19736,7 @@
                 <w:sz w:val="19"/>
                 <w:szCs w:val="19"/>
               </w:rPr>
-              <w:t xml:space="preserve">Si R_E cambió en P2, repetir también la apertura con el mismo presupuesto para que los 3 tramos sean comparables.</w:t>
+              <w:t xml:space="preserve">Si R_E cambia (solo si se activa la opción A, ver P2), repetir también la apertura con el mismo presupuesto para que los 3 tramos sean comparables.</w:t>
             </w:r>
           </w:p>
         </w:tc>
@@ -23718,7 +23701,7 @@
                 <w:sz w:val="19"/>
                 <w:szCs w:val="19"/>
               </w:rPr>
-              <w:t xml:space="preserve">A) El riesgo del inventario pendiente: R_E = (P_mid − P_ejec)·q − β·σ²·Q_pendiente (por paso). Así no operar deja de ser gratis y se incentiva terminar la orden. Obliga a repetir β* y la fase 2 de β. Es una desviación de la fórmula del Título I si ésta define q como cantidad ejecutada; habría que anotarlo.</w:t>
+              <w:t xml:space="preserve">0) (propuesta de PS, la más fiel al Título I) Mantener la fórmula del Título I (riesgo sobre lo ejecutado) y el β calibrado, 0,0061796 (0,1·β*), con una regla de vigilancia: en la 2.3.5, si el cumplimiento de la orden baja del 95 %, se pasa a la opción A. Se revisa al final del Sprint 5 (viernes 23 oct).</w:t>
             </w:r>
           </w:p>
           <w:p>
@@ -23736,7 +23719,7 @@
                 <w:sz w:val="19"/>
                 <w:szCs w:val="19"/>
               </w:rPr>
-              <w:t xml:space="preserve">B) Mantener la fórmula del Título I y entrenar la 2.3.5 con β = 0, declarando el riesgo como no calibrado (límite).</w:t>
+              <w:t xml:space="preserve">A) El riesgo del inventario pendiente: R_E = (P_mid − P_ejec)·q − β·σ²·Q_pendiente (por paso). Así no operar deja de ser gratis. Cambia lo que significa q respecto del Título I (desviación que hay que justificar) y obliga a repetir β* y la fase 2. Ya está implementada y apagada por defecto.</w:t>
             </w:r>
           </w:p>
           <w:p>
@@ -23754,7 +23737,25 @@
                 <w:sz w:val="19"/>
                 <w:szCs w:val="19"/>
               </w:rPr>
-              <w:t xml:space="preserve">C) Mantener β = 0,1·β* y agregar un bono o penalización de cumplimiento. Es un término nuevo que no está en el Título I.</w:t>
+              <w:t xml:space="preserve">B) Fórmula igual con β = 0: apaga el término de riesgo que el Título I pide calibrar; es peor que la opción 0.</w:t>
+            </w:r>
+          </w:p>
+          <w:p>
+            <w:pPr>
+              <w:pStyle w:val="ListParagraph"/>
+              <w:numPr>
+                <w:ilvl w:val="0"/>
+                <w:numId w:val="2"/>
+              </w:numPr>
+              <w:spacing w:after="40"/>
+            </w:pPr>
+            <w:r>
+              <w:rPr>
+                <w:rFonts w:ascii="Calibri" w:cs="Calibri" w:eastAsia="Calibri" w:hAnsi="Calibri"/>
+                <w:sz w:val="19"/>
+                <w:szCs w:val="19"/>
+              </w:rPr>
+              <w:t xml:space="preserve">C) β = 0,1·β* más un premio o castigo de cumplimiento: agrega un término que el Título I no tiene.</w:t>
             </w:r>
           </w:p>
         </w:tc>
@@ -23821,7 +23822,7 @@
                 <w:sz w:val="19"/>
                 <w:szCs w:val="19"/>
               </w:rPr>
-              <w:t xml:space="preserve">A si BF decide el miércoles 14 oct y alcanza a repetirse β antes del 20 oct. Si no, B para no bloquear la 2.3.5.</w:t>
+              <w:t xml:space="preserve">0. El Título I pide calibrar β sobre la fórmula escrita, y eso ya se hizo (con 0,1·β* la red completa el 100 % de la orden). La opción A queda lista como plan de contingencia con una regla fijada antes de ver datos.</w:t>
             </w:r>
           </w:p>
         </w:tc>
@@ -23955,7 +23956,7 @@
                 <w:sz w:val="19"/>
                 <w:szCs w:val="19"/>
               </w:rPr>
-              <w:t xml:space="preserve">Miércoles 14 oct, 18:00</w:t>
+              <w:t xml:space="preserve">Miércoles 14 oct, 18:00; revisión final viernes 23 oct</w:t>
             </w:r>
           </w:p>
         </w:tc>
@@ -24022,7 +24023,7 @@
                 <w:sz w:val="19"/>
                 <w:szCs w:val="19"/>
               </w:rPr>
-              <w:t xml:space="preserve">Rige la opción B.</w:t>
+              <w:t xml:space="preserve">Rige la opción 0.</w:t>
             </w:r>
           </w:p>
         </w:tc>
@@ -26416,7 +26417,7 @@
                 <w:sz w:val="18"/>
                 <w:szCs w:val="18"/>
               </w:rPr>
-              <w:t xml:space="preserve">Por defecto la opción B (β = 0) para no bloquear; se anota como límite.</w:t>
+              <w:t xml:space="preserve">Por defecto rige la opción 0 (fórmula del Título I con el β actual), que no exige cambios. La opción A queda como contingencia con una regla fijada antes de ver datos.</w:t>
             </w:r>
           </w:p>
         </w:tc>

</xml_diff>